<commit_message>
Apply premium academic style to all project documents
New .docx from markdown (Georgia · Navy #1B2A4A · Gold #C9A84C):
- 08_Architecture/MindBridge_SAD.docx       (Section 8, 20 marks)
- 09_Team_Docs/MindBridge_Scrum_Report.docx (Section 2, 5 marks)
- MindBridge_User_Manual.docx               (Section 10 documentation)

Restyled existing .docx (Heading/Normal styles patched):
- MindBridge_SRS.docx
- MindBridge_Project_Document.docx
- MindBridge_TechStack.docx
- MindBridge_UX_Navigation_Flow.docx
</commit_message>
<xml_diff>
--- a/03_Project_Document/MindBridge_Project_Document.docx
+++ b/03_Project_Document/MindBridge_Project_Document.docx
@@ -5531,50 +5531,6 @@
     <w:rPr>
       <w:sz w:val="56"/>
       <w:szCs w:val="56"/>
-    </w:rPr>
-  </w:style>
-  <w:style w:type="paragraph" w:styleId="Heading1">
-    <w:name w:val="Heading 1"/>
-    <w:basedOn w:val="Normal"/>
-    <w:next w:val="Normal"/>
-    <w:qFormat/>
-    <w:rPr>
-      <w:color w:val="2E74B5"/>
-      <w:sz w:val="32"/>
-      <w:szCs w:val="32"/>
-    </w:rPr>
-  </w:style>
-  <w:style w:type="paragraph" w:styleId="Heading2">
-    <w:name w:val="Heading 2"/>
-    <w:basedOn w:val="Normal"/>
-    <w:next w:val="Normal"/>
-    <w:qFormat/>
-    <w:rPr>
-      <w:color w:val="2E74B5"/>
-      <w:sz w:val="26"/>
-      <w:szCs w:val="26"/>
-    </w:rPr>
-  </w:style>
-  <w:style w:type="paragraph" w:styleId="Heading3">
-    <w:name w:val="Heading 3"/>
-    <w:basedOn w:val="Normal"/>
-    <w:next w:val="Normal"/>
-    <w:qFormat/>
-    <w:rPr>
-      <w:color w:val="1F4D78"/>
-      <w:sz w:val="24"/>
-      <w:szCs w:val="24"/>
-    </w:rPr>
-  </w:style>
-  <w:style w:type="paragraph" w:styleId="Heading4">
-    <w:name w:val="Heading 4"/>
-    <w:basedOn w:val="Normal"/>
-    <w:next w:val="Normal"/>
-    <w:qFormat/>
-    <w:rPr>
-      <w:i/>
-      <w:iCs/>
-      <w:color w:val="2E74B5"/>
     </w:rPr>
   </w:style>
   <w:style w:type="paragraph" w:styleId="Heading5">
@@ -5658,40 +5614,68 @@
     </w:rPr>
   </w:style>
   <w:style w:type="paragraph" w:styleId="Heading1">
-    <w:name w:val="Heading 1"/>
+    <w:name w:val="heading 1"/>
     <w:basedOn w:val="Normal"/>
     <w:next w:val="Normal"/>
-    <w:qFormat/>
     <w:pPr>
-      <w:spacing w:before="320" w:after="160"/>
+      <w:spacing w:before="480" w:after="200"/>
       <w:outlineLvl w:val="0"/>
     </w:pPr>
     <w:rPr>
-      <w:rFonts w:ascii="Arial" w:cs="Arial" w:eastAsia="Arial" w:hAnsi="Arial"/>
+      <w:rFonts w:ascii="Georgia" w:hAnsi="Georgia" w:cs="Georgia"/>
       <w:b/>
       <w:bCs/>
-      <w:color w:val="1A5276"/>
-      <w:sz w:val="32"/>
-      <w:szCs w:val="32"/>
+      <w:color w:val="1B2A4A"/>
+      <w:sz w:val="36"/>
+      <w:szCs w:val="36"/>
     </w:rPr>
   </w:style>
   <w:style w:type="paragraph" w:styleId="Heading2">
-    <w:name w:val="Heading 2"/>
+    <w:name w:val="heading 2"/>
     <w:basedOn w:val="Normal"/>
     <w:next w:val="Normal"/>
-    <w:qFormat/>
     <w:pPr>
-      <w:spacing w:before="240" w:after="120"/>
+      <w:spacing w:before="320" w:after="120"/>
       <w:outlineLvl w:val="1"/>
     </w:pPr>
     <w:rPr>
-      <w:rFonts w:ascii="Arial" w:cs="Arial" w:eastAsia="Arial" w:hAnsi="Arial"/>
+      <w:rFonts w:ascii="Georgia" w:hAnsi="Georgia" w:cs="Georgia"/>
       <w:b/>
       <w:bCs/>
-      <w:color w:val="1E8449"/>
-      <w:sz w:val="26"/>
-      <w:szCs w:val="26"/>
+      <w:color w:val="1B2A4A"/>
+      <w:sz w:val="28"/>
+      <w:szCs w:val="28"/>
     </w:rPr>
+  </w:style>
+  <w:style w:type="paragraph" w:styleId="Heading3">
+    <w:name w:val="heading 3"/>
+    <w:basedOn w:val="Normal"/>
+    <w:next w:val="Normal"/>
+    <w:pPr>
+      <w:spacing w:before="240" w:after="80"/>
+      <w:outlineLvl w:val="2"/>
+    </w:pPr>
+    <w:rPr>
+      <w:rFonts w:ascii="Georgia" w:hAnsi="Georgia" w:cs="Georgia"/>
+      <w:b/>
+      <w:bCs/>
+      <w:color w:val="1B2A4A"/>
+      <w:sz w:val="24"/>
+      <w:szCs w:val="24"/>
+    </w:rPr>
+  </w:style>
+  <w:style w:type="paragraph" w:styleId="Normal">
+    <w:name w:val="Normal"/>
+    <w:rPr>
+      <w:rFonts w:ascii="Georgia" w:hAnsi="Georgia" w:cs="Georgia"/>
+      <w:color w:val="000000"/>
+      <w:sz w:val="24"/>
+      <w:szCs w:val="24"/>
+    </w:rPr>
+    <w:pPr>
+      <w:jc w:val="both"/>
+      <w:spacing w:after="160" w:line="340" w:lineRule="auto"/>
+    </w:pPr>
   </w:style>
 </w:styles>
 </file>
</xml_diff>